<commit_message>
end is a new beginning
</commit_message>
<xml_diff>
--- a/8 семестр/МиСИИ/РГР/ПЗ.docx
+++ b/8 семестр/МиСИИ/РГР/ПЗ.docx
@@ -730,7 +730,7 @@
           <w:rFonts w:eastAsia="Times New Roman" w:cs="Times New Roman"/>
           <w:sz w:val="24"/>
           <w:szCs w:val="24"/>
-          <w:lang w:val="en-US" w:bidi="en-US"/>
+          <w:lang w:bidi="en-US"/>
         </w:rPr>
         <w:br w:type="page"/>
       </w:r>
@@ -757,25 +757,7 @@
       <w:bookmarkStart w:id="2" w:name="_Hlk158638100"/>
       <w:bookmarkEnd w:id="1"/>
       <w:r>
-        <w:t>Разработать на языке Пролог реляционную базу данных (не меньше 5 фактов), соответствующую привед</w:t>
-      </w:r>
-      <w:r>
-        <w:t>ё</w:t>
-      </w:r>
-      <w:r>
-        <w:t>нной таблице</w:t>
-      </w:r>
-      <w:r>
-        <w:t xml:space="preserve"> (таблица 1).</w:t>
-      </w:r>
-      <w:r>
-        <w:t xml:space="preserve"> </w:t>
-      </w:r>
-      <w:r>
-        <w:t>С</w:t>
-      </w:r>
-      <w:r>
-        <w:t>оставить 5 правил, удовлетворяющих условиям:</w:t>
+        <w:t>Разработать на языке Пролог реляционную базу данных (не меньше 5 фактов), соответствующую приведённой таблице (таблица 1). Составить 5 правил, удовлетворяющих условиям:</w:t>
       </w:r>
     </w:p>
     <w:p>
@@ -811,13 +793,7 @@
         </w:numPr>
       </w:pPr>
       <w:r>
-        <w:t>проверить, верно ли, что в базе данных есть хотя бы одна книга, у которой ФИО автора и ФИО абонента совпадают (если есть, то вывести е</w:t>
-      </w:r>
-      <w:r>
-        <w:t>ё</w:t>
-      </w:r>
-      <w:r>
-        <w:t xml:space="preserve"> номер);</w:t>
+        <w:t>проверить, верно ли, что в базе данных есть хотя бы одна книга, у которой ФИО автора и ФИО абонента совпадают (если есть, то вывести её номер);</w:t>
       </w:r>
     </w:p>
     <w:p>
@@ -829,13 +805,7 @@
         </w:numPr>
       </w:pPr>
       <w:r>
-        <w:t>вывести название всех книг, выданных абоненту, ФИО которого зада</w:t>
-      </w:r>
-      <w:r>
-        <w:t>ё</w:t>
-      </w:r>
-      <w:r>
-        <w:t>т пользователь;</w:t>
+        <w:t>вывести название всех книг, выданных абоненту, ФИО которого задаёт пользователь;</w:t>
       </w:r>
     </w:p>
     <w:p>
@@ -1070,10 +1040,1172 @@
     </w:p>
     <w:p/>
     <w:p/>
+    <w:p>
+      <w:r>
+        <w:t xml:space="preserve">Первым делом на языке </w:t>
+      </w:r>
+      <w:r>
+        <w:rPr>
+          <w:lang w:val="en-US"/>
+        </w:rPr>
+        <w:t>Prolog</w:t>
+      </w:r>
+      <w:r>
+        <w:t xml:space="preserve"> </w:t>
+      </w:r>
+      <w:r>
+        <w:t xml:space="preserve">была разработана реляционная база данных. Она была представлена в виде множества фактов </w:t>
+      </w:r>
+      <w:r>
+        <w:rPr>
+          <w:rFonts w:ascii="Courier New" w:hAnsi="Courier New" w:cs="Courier New"/>
+          <w:sz w:val="24"/>
+          <w:szCs w:val="20"/>
+        </w:rPr>
+        <w:t>книга/8</w:t>
+      </w:r>
+      <w:r>
+        <w:t>, каждый из которых соответствует кортежу БД (листинг 2.1).</w:t>
+      </w:r>
+    </w:p>
     <w:p/>
     <w:p>
       <w:r>
-        <w:br w:type="page"/>
+        <w:t>Листинг 2.1 – База данных на языке Пролог</w:t>
+      </w:r>
+    </w:p>
+    <w:p>
+      <w:pPr>
+        <w:pStyle w:val="ac"/>
+      </w:pPr>
+      <w:r>
+        <w:t>% ---------------- БАЗА ДАННЫХ ----------------</w:t>
+      </w:r>
+    </w:p>
+    <w:p>
+      <w:pPr>
+        <w:pStyle w:val="ac"/>
+        <w:rPr>
+          <w:lang w:val="ru-RU"/>
+        </w:rPr>
+      </w:pPr>
+      <w:r>
+        <w:rPr>
+          <w:lang w:val="ru-RU"/>
+        </w:rPr>
+        <w:t>% № | Автор книги | Название книги | Издательство</w:t>
+      </w:r>
+      <w:r>
+        <w:rPr>
+          <w:lang w:val="ru-RU"/>
+        </w:rPr>
+        <w:t xml:space="preserve"> </w:t>
+      </w:r>
+      <w:r>
+        <w:rPr>
+          <w:lang w:val="ru-RU"/>
+        </w:rPr>
+        <w:t>| Дата выдачи</w:t>
+      </w:r>
+      <w:r>
+        <w:rPr>
+          <w:lang w:val="ru-RU"/>
+        </w:rPr>
+        <w:t xml:space="preserve"> </w:t>
+      </w:r>
+      <w:r>
+        <w:rPr>
+          <w:lang w:val="ru-RU"/>
+        </w:rPr>
+        <w:t>| ФИО абонента | Цена | Срок возврата</w:t>
+      </w:r>
+    </w:p>
+    <w:p>
+      <w:pPr>
+        <w:pStyle w:val="ac"/>
+        <w:rPr>
+          <w:lang w:val="ru-RU"/>
+        </w:rPr>
+      </w:pPr>
+      <w:proofErr w:type="gramStart"/>
+      <w:r>
+        <w:rPr>
+          <w:lang w:val="ru-RU"/>
+        </w:rPr>
+        <w:t>книга(</w:t>
+      </w:r>
+      <w:proofErr w:type="gramEnd"/>
+      <w:r>
+        <w:rPr>
+          <w:lang w:val="ru-RU"/>
+        </w:rPr>
+        <w:t>1, 'Егор Курпатый',</w:t>
+      </w:r>
+      <w:r>
+        <w:rPr>
+          <w:lang w:val="ru-RU"/>
+        </w:rPr>
+        <w:t xml:space="preserve"> </w:t>
+      </w:r>
+      <w:r>
+        <w:rPr>
+          <w:lang w:val="ru-RU"/>
+        </w:rPr>
+        <w:t xml:space="preserve">'Войти в </w:t>
+      </w:r>
+      <w:r>
+        <w:t>IT</w:t>
+      </w:r>
+      <w:r>
+        <w:rPr>
+          <w:lang w:val="ru-RU"/>
+        </w:rPr>
+        <w:t>',</w:t>
+      </w:r>
+      <w:r>
+        <w:rPr>
+          <w:lang w:val="ru-RU"/>
+        </w:rPr>
+        <w:t xml:space="preserve"> </w:t>
+      </w:r>
+      <w:r>
+        <w:rPr>
+          <w:lang w:val="ru-RU"/>
+        </w:rPr>
+        <w:t>'Эксмо',</w:t>
+      </w:r>
+      <w:r>
+        <w:rPr>
+          <w:lang w:val="ru-RU"/>
+        </w:rPr>
+        <w:t xml:space="preserve"> </w:t>
+      </w:r>
+      <w:r>
+        <w:rPr>
+          <w:lang w:val="ru-RU"/>
+        </w:rPr>
+        <w:t>'25.06.2025',</w:t>
+      </w:r>
+      <w:r>
+        <w:rPr>
+          <w:lang w:val="ru-RU"/>
+        </w:rPr>
+        <w:t xml:space="preserve"> </w:t>
+      </w:r>
+      <w:r>
+        <w:rPr>
+          <w:lang w:val="ru-RU"/>
+        </w:rPr>
+        <w:t>'Егор Курпатый',</w:t>
+      </w:r>
+      <w:r>
+        <w:rPr>
+          <w:lang w:val="ru-RU"/>
+        </w:rPr>
+        <w:t xml:space="preserve"> </w:t>
+      </w:r>
+      <w:r>
+        <w:rPr>
+          <w:lang w:val="ru-RU"/>
+        </w:rPr>
+        <w:t>512, 10).</w:t>
+      </w:r>
+    </w:p>
+    <w:p>
+      <w:pPr>
+        <w:pStyle w:val="ac"/>
+        <w:rPr>
+          <w:lang w:val="ru-RU"/>
+        </w:rPr>
+      </w:pPr>
+      <w:proofErr w:type="gramStart"/>
+      <w:r>
+        <w:rPr>
+          <w:lang w:val="ru-RU"/>
+        </w:rPr>
+        <w:t>книга(</w:t>
+      </w:r>
+      <w:proofErr w:type="gramEnd"/>
+      <w:r>
+        <w:rPr>
+          <w:lang w:val="ru-RU"/>
+        </w:rPr>
+        <w:t>2, 'Михаил Шолохов',</w:t>
+      </w:r>
+      <w:r>
+        <w:rPr>
+          <w:lang w:val="ru-RU"/>
+        </w:rPr>
+        <w:t xml:space="preserve"> </w:t>
+      </w:r>
+      <w:r>
+        <w:rPr>
+          <w:lang w:val="ru-RU"/>
+        </w:rPr>
+        <w:t>'Тихий Дон',</w:t>
+      </w:r>
+      <w:r>
+        <w:rPr>
+          <w:lang w:val="ru-RU"/>
+        </w:rPr>
+        <w:t xml:space="preserve"> </w:t>
+      </w:r>
+      <w:r>
+        <w:rPr>
+          <w:lang w:val="ru-RU"/>
+        </w:rPr>
+        <w:t>'Эксмо',</w:t>
+      </w:r>
+      <w:r>
+        <w:rPr>
+          <w:lang w:val="ru-RU"/>
+        </w:rPr>
+        <w:t xml:space="preserve"> </w:t>
+      </w:r>
+      <w:r>
+        <w:rPr>
+          <w:lang w:val="ru-RU"/>
+        </w:rPr>
+        <w:t>'16.01.2026', 'Иван Липин',</w:t>
+      </w:r>
+      <w:r>
+        <w:rPr>
+          <w:lang w:val="ru-RU"/>
+        </w:rPr>
+        <w:t xml:space="preserve"> </w:t>
+      </w:r>
+      <w:r>
+        <w:rPr>
+          <w:lang w:val="ru-RU"/>
+        </w:rPr>
+        <w:t>993, 10).</w:t>
+      </w:r>
+    </w:p>
+    <w:p>
+      <w:pPr>
+        <w:pStyle w:val="ac"/>
+        <w:rPr>
+          <w:lang w:val="ru-RU"/>
+        </w:rPr>
+      </w:pPr>
+      <w:proofErr w:type="gramStart"/>
+      <w:r>
+        <w:rPr>
+          <w:lang w:val="ru-RU"/>
+        </w:rPr>
+        <w:t>книга(</w:t>
+      </w:r>
+      <w:proofErr w:type="gramEnd"/>
+      <w:r>
+        <w:rPr>
+          <w:lang w:val="ru-RU"/>
+        </w:rPr>
+        <w:t xml:space="preserve">3, 'Джен </w:t>
+      </w:r>
+      <w:proofErr w:type="spellStart"/>
+      <w:r>
+        <w:rPr>
+          <w:lang w:val="ru-RU"/>
+        </w:rPr>
+        <w:t>Синсеро</w:t>
+      </w:r>
+      <w:proofErr w:type="spellEnd"/>
+      <w:r>
+        <w:rPr>
+          <w:lang w:val="ru-RU"/>
+        </w:rPr>
+        <w:t>',</w:t>
+      </w:r>
+      <w:r>
+        <w:rPr>
+          <w:lang w:val="ru-RU"/>
+        </w:rPr>
+        <w:t xml:space="preserve"> </w:t>
+      </w:r>
+      <w:r>
+        <w:rPr>
+          <w:lang w:val="ru-RU"/>
+        </w:rPr>
+        <w:t>'НИ СЫ. Будь уверен в себе',</w:t>
+      </w:r>
+      <w:r>
+        <w:rPr>
+          <w:lang w:val="ru-RU"/>
+        </w:rPr>
+        <w:t xml:space="preserve"> </w:t>
+      </w:r>
+      <w:r>
+        <w:rPr>
+          <w:lang w:val="ru-RU"/>
+        </w:rPr>
+        <w:t>'АСТ',</w:t>
+      </w:r>
+      <w:r>
+        <w:rPr>
+          <w:lang w:val="ru-RU"/>
+        </w:rPr>
+        <w:t xml:space="preserve"> </w:t>
+      </w:r>
+      <w:r>
+        <w:rPr>
+          <w:lang w:val="ru-RU"/>
+        </w:rPr>
+        <w:t>'25.06.2025', 'Иван Липин',</w:t>
+      </w:r>
+      <w:r>
+        <w:rPr>
+          <w:lang w:val="ru-RU"/>
+        </w:rPr>
+        <w:t xml:space="preserve"> </w:t>
+      </w:r>
+      <w:r>
+        <w:rPr>
+          <w:lang w:val="ru-RU"/>
+        </w:rPr>
+        <w:t>777, 10).</w:t>
+      </w:r>
+    </w:p>
+    <w:p>
+      <w:pPr>
+        <w:pStyle w:val="ac"/>
+        <w:rPr>
+          <w:lang w:val="ru-RU"/>
+        </w:rPr>
+      </w:pPr>
+      <w:proofErr w:type="gramStart"/>
+      <w:r>
+        <w:rPr>
+          <w:lang w:val="ru-RU"/>
+        </w:rPr>
+        <w:t>книга(</w:t>
+      </w:r>
+      <w:proofErr w:type="gramEnd"/>
+      <w:r>
+        <w:rPr>
+          <w:lang w:val="ru-RU"/>
+        </w:rPr>
+        <w:t>4, 'Кирилл Кротов',</w:t>
+      </w:r>
+      <w:r>
+        <w:rPr>
+          <w:lang w:val="ru-RU"/>
+        </w:rPr>
+        <w:t xml:space="preserve"> </w:t>
+      </w:r>
+      <w:r>
+        <w:rPr>
+          <w:lang w:val="ru-RU"/>
+        </w:rPr>
+        <w:t xml:space="preserve">'Модели </w:t>
+      </w:r>
+      <w:r>
+        <w:t>MILP</w:t>
+      </w:r>
+      <w:r>
+        <w:rPr>
+          <w:lang w:val="ru-RU"/>
+        </w:rPr>
+        <w:t xml:space="preserve"> для задач оптимизации', '</w:t>
+      </w:r>
+      <w:proofErr w:type="spellStart"/>
+      <w:r>
+        <w:rPr>
+          <w:lang w:val="ru-RU"/>
+        </w:rPr>
+        <w:t>СуперПрогерРУ</w:t>
+      </w:r>
+      <w:proofErr w:type="spellEnd"/>
+      <w:r>
+        <w:rPr>
+          <w:lang w:val="ru-RU"/>
+        </w:rPr>
+        <w:t>', '01.11.2024', 'Мовенко Константин', 666, 10).</w:t>
+      </w:r>
+    </w:p>
+    <w:p>
+      <w:pPr>
+        <w:pStyle w:val="ac"/>
+        <w:rPr>
+          <w:lang w:val="ru-RU"/>
+        </w:rPr>
+      </w:pPr>
+      <w:proofErr w:type="gramStart"/>
+      <w:r>
+        <w:rPr>
+          <w:lang w:val="ru-RU"/>
+        </w:rPr>
+        <w:t>книга(</w:t>
+      </w:r>
+      <w:proofErr w:type="gramEnd"/>
+      <w:r>
+        <w:rPr>
+          <w:lang w:val="ru-RU"/>
+        </w:rPr>
+        <w:t>5, 'Юрий Петухов',</w:t>
+      </w:r>
+      <w:r>
+        <w:rPr>
+          <w:lang w:val="ru-RU"/>
+        </w:rPr>
+        <w:t xml:space="preserve"> </w:t>
+      </w:r>
+      <w:r>
+        <w:rPr>
+          <w:lang w:val="ru-RU"/>
+        </w:rPr>
+        <w:t>'Тайны древних русов',</w:t>
+      </w:r>
+      <w:r>
+        <w:rPr>
+          <w:lang w:val="ru-RU"/>
+        </w:rPr>
+        <w:t xml:space="preserve"> </w:t>
+      </w:r>
+      <w:r>
+        <w:rPr>
+          <w:lang w:val="ru-RU"/>
+        </w:rPr>
+        <w:t>'ВЕДА',</w:t>
+      </w:r>
+      <w:r>
+        <w:rPr>
+          <w:lang w:val="ru-RU"/>
+        </w:rPr>
+        <w:t xml:space="preserve"> </w:t>
+      </w:r>
+      <w:r>
+        <w:rPr>
+          <w:lang w:val="ru-RU"/>
+        </w:rPr>
+        <w:t>'24.05.2020',</w:t>
+      </w:r>
+      <w:r>
+        <w:rPr>
+          <w:lang w:val="ru-RU"/>
+        </w:rPr>
+        <w:t xml:space="preserve"> </w:t>
+      </w:r>
+      <w:r>
+        <w:rPr>
+          <w:lang w:val="ru-RU"/>
+        </w:rPr>
+        <w:t>'Ясень Вишневецкий',</w:t>
+      </w:r>
+      <w:r>
+        <w:rPr>
+          <w:lang w:val="ru-RU"/>
+        </w:rPr>
+        <w:t xml:space="preserve"> </w:t>
+      </w:r>
+      <w:r>
+        <w:rPr>
+          <w:lang w:val="ru-RU"/>
+        </w:rPr>
+        <w:t>228, 10).</w:t>
+      </w:r>
+    </w:p>
+    <w:p/>
+    <w:p>
+      <w:r>
+        <w:t xml:space="preserve">Затем были написаны правила </w:t>
+      </w:r>
+      <w:r>
+        <w:rPr>
+          <w:lang w:val="en-US"/>
+        </w:rPr>
+        <w:t>rule</w:t>
+      </w:r>
+      <w:r>
+        <w:t>-</w:t>
+      </w:r>
+      <w:r>
+        <w:rPr>
+          <w:lang w:val="en-US"/>
+        </w:rPr>
+        <w:t>rule</w:t>
+      </w:r>
+      <w:r>
+        <w:t>5</w:t>
+      </w:r>
+      <w:r>
+        <w:t>, соответствующие заданным по варианту условиям (листинг 2.2).</w:t>
+      </w:r>
+    </w:p>
+    <w:p/>
+    <w:p>
+      <w:r>
+        <w:t>Листинг 2.2 – Правила к базе данных</w:t>
+      </w:r>
+    </w:p>
+    <w:p>
+      <w:pPr>
+        <w:pStyle w:val="ac"/>
+      </w:pPr>
+      <w:r>
+        <w:t>% ---------------- ПРАВИЛА ----------------</w:t>
+      </w:r>
+    </w:p>
+    <w:p>
+      <w:pPr>
+        <w:pStyle w:val="ac"/>
+      </w:pPr>
+      <w:r>
+        <w:t>% 1. Проверка наличия книги со сроком возврата &gt; 5, но &lt; 14 суток</w:t>
+      </w:r>
+    </w:p>
+    <w:p>
+      <w:pPr>
+        <w:pStyle w:val="ac"/>
+      </w:pPr>
+      <w:r>
+        <w:rPr>
+          <w:b/>
+          <w:bCs/>
+        </w:rPr>
+        <w:t>rule</w:t>
+      </w:r>
+      <w:proofErr w:type="gramStart"/>
+      <w:r>
+        <w:rPr>
+          <w:b/>
+          <w:bCs/>
+        </w:rPr>
+        <w:t>1</w:t>
+      </w:r>
+      <w:r>
+        <w:t xml:space="preserve"> :</w:t>
+      </w:r>
+      <w:proofErr w:type="gramEnd"/>
+      <w:r>
+        <w:t>-</w:t>
+      </w:r>
+    </w:p>
+    <w:p>
+      <w:pPr>
+        <w:pStyle w:val="ac"/>
+      </w:pPr>
+      <w:r>
+        <w:t xml:space="preserve">    </w:t>
+      </w:r>
+      <w:proofErr w:type="gramStart"/>
+      <w:r>
+        <w:t>книга(</w:t>
+      </w:r>
+      <w:proofErr w:type="gramEnd"/>
+      <w:r>
+        <w:t>_, _, _, _, _, _, _, Days),</w:t>
+      </w:r>
+    </w:p>
+    <w:p>
+      <w:pPr>
+        <w:pStyle w:val="ac"/>
+      </w:pPr>
+      <w:r>
+        <w:t>    Days &gt; 5, Days &lt; 14</w:t>
+      </w:r>
+      <w:proofErr w:type="gramStart"/>
+      <w:r>
+        <w:t>, !</w:t>
+      </w:r>
+      <w:proofErr w:type="gramEnd"/>
+      <w:r>
+        <w:t>.</w:t>
+      </w:r>
+    </w:p>
+    <w:p>
+      <w:pPr>
+        <w:pStyle w:val="ac"/>
+      </w:pPr>
+    </w:p>
+    <w:p>
+      <w:pPr>
+        <w:pStyle w:val="ac"/>
+      </w:pPr>
+      <w:r>
+        <w:t>% 2. Проверка наличия книги со сроком возврата &gt; 14 или &lt; 5 суток</w:t>
+      </w:r>
+    </w:p>
+    <w:p>
+      <w:pPr>
+        <w:pStyle w:val="ac"/>
+      </w:pPr>
+      <w:r>
+        <w:rPr>
+          <w:b/>
+          <w:bCs/>
+        </w:rPr>
+        <w:t>rule</w:t>
+      </w:r>
+      <w:proofErr w:type="gramStart"/>
+      <w:r>
+        <w:rPr>
+          <w:b/>
+          <w:bCs/>
+        </w:rPr>
+        <w:t>2</w:t>
+      </w:r>
+      <w:r>
+        <w:t xml:space="preserve"> :</w:t>
+      </w:r>
+      <w:proofErr w:type="gramEnd"/>
+      <w:r>
+        <w:t>-</w:t>
+      </w:r>
+    </w:p>
+    <w:p>
+      <w:pPr>
+        <w:pStyle w:val="ac"/>
+      </w:pPr>
+      <w:r>
+        <w:t xml:space="preserve">    </w:t>
+      </w:r>
+      <w:proofErr w:type="gramStart"/>
+      <w:r>
+        <w:rPr>
+          <w:lang w:val="ru-RU"/>
+        </w:rPr>
+        <w:t>книга</w:t>
+      </w:r>
+      <w:r>
+        <w:t>(</w:t>
+      </w:r>
+      <w:proofErr w:type="gramEnd"/>
+      <w:r>
+        <w:t>_, _, _, _, _, _, _, Days),</w:t>
+      </w:r>
+    </w:p>
+    <w:p>
+      <w:pPr>
+        <w:pStyle w:val="ac"/>
+      </w:pPr>
+      <w:r>
+        <w:t xml:space="preserve">    (Days &gt; </w:t>
+      </w:r>
+      <w:proofErr w:type="gramStart"/>
+      <w:r>
+        <w:t>14 ;</w:t>
+      </w:r>
+      <w:proofErr w:type="gramEnd"/>
+      <w:r>
+        <w:t xml:space="preserve"> Days &lt; 5)</w:t>
+      </w:r>
+      <w:proofErr w:type="gramStart"/>
+      <w:r>
+        <w:t>, !</w:t>
+      </w:r>
+      <w:proofErr w:type="gramEnd"/>
+      <w:r>
+        <w:t>.</w:t>
+      </w:r>
+    </w:p>
+    <w:p>
+      <w:pPr>
+        <w:pStyle w:val="ac"/>
+      </w:pPr>
+    </w:p>
+    <w:p>
+      <w:pPr>
+        <w:pStyle w:val="ac"/>
+      </w:pPr>
+      <w:r>
+        <w:t>% 3. Проверка наличия книги, у которой ФИО автора совпадает с ФИО абонента</w:t>
+      </w:r>
+    </w:p>
+    <w:p>
+      <w:pPr>
+        <w:pStyle w:val="ac"/>
+      </w:pPr>
+      <w:r>
+        <w:rPr>
+          <w:b/>
+          <w:bCs/>
+        </w:rPr>
+        <w:t>rule3</w:t>
+      </w:r>
+      <w:r>
+        <w:t>(</w:t>
+      </w:r>
+      <w:proofErr w:type="spellStart"/>
+      <w:r>
+        <w:t>BookID</w:t>
+      </w:r>
+      <w:proofErr w:type="spellEnd"/>
+      <w:proofErr w:type="gramStart"/>
+      <w:r>
+        <w:t>) :</w:t>
+      </w:r>
+      <w:proofErr w:type="gramEnd"/>
+      <w:r>
+        <w:t>-</w:t>
+      </w:r>
+    </w:p>
+    <w:p>
+      <w:pPr>
+        <w:pStyle w:val="ac"/>
+      </w:pPr>
+      <w:r>
+        <w:t xml:space="preserve">    </w:t>
+      </w:r>
+      <w:proofErr w:type="spellStart"/>
+      <w:proofErr w:type="gramStart"/>
+      <w:r>
+        <w:t>книга</w:t>
+      </w:r>
+      <w:proofErr w:type="spellEnd"/>
+      <w:r>
+        <w:t>(</w:t>
+      </w:r>
+      <w:proofErr w:type="spellStart"/>
+      <w:proofErr w:type="gramEnd"/>
+      <w:r>
+        <w:t>BookID</w:t>
+      </w:r>
+      <w:proofErr w:type="spellEnd"/>
+      <w:r>
+        <w:t>, Author, _, _, _, Borrower, _, _),</w:t>
+      </w:r>
+    </w:p>
+    <w:p>
+      <w:pPr>
+        <w:pStyle w:val="ac"/>
+      </w:pPr>
+      <w:r>
+        <w:t>    Author == Borrower.</w:t>
+      </w:r>
+    </w:p>
+    <w:p>
+      <w:pPr>
+        <w:pStyle w:val="ac"/>
+      </w:pPr>
+    </w:p>
+    <w:p>
+      <w:pPr>
+        <w:pStyle w:val="ac"/>
+      </w:pPr>
+      <w:r>
+        <w:t>% 4. Вывод всех названий книг, выданных заданному абоненту</w:t>
+      </w:r>
+    </w:p>
+    <w:p>
+      <w:pPr>
+        <w:pStyle w:val="ac"/>
+      </w:pPr>
+      <w:r>
+        <w:rPr>
+          <w:b/>
+          <w:bCs/>
+        </w:rPr>
+        <w:t>rule4</w:t>
+      </w:r>
+      <w:r>
+        <w:t xml:space="preserve">(Borrower, </w:t>
+      </w:r>
+      <w:proofErr w:type="spellStart"/>
+      <w:r>
+        <w:t>Book_list</w:t>
+      </w:r>
+      <w:proofErr w:type="spellEnd"/>
+      <w:proofErr w:type="gramStart"/>
+      <w:r>
+        <w:t>) :</w:t>
+      </w:r>
+      <w:proofErr w:type="gramEnd"/>
+      <w:r>
+        <w:t>-</w:t>
+      </w:r>
+    </w:p>
+    <w:p>
+      <w:pPr>
+        <w:pStyle w:val="ac"/>
+      </w:pPr>
+      <w:r>
+        <w:t xml:space="preserve">    </w:t>
+      </w:r>
+      <w:proofErr w:type="spellStart"/>
+      <w:proofErr w:type="gramStart"/>
+      <w:r>
+        <w:t>findall</w:t>
+      </w:r>
+      <w:proofErr w:type="spellEnd"/>
+      <w:r>
+        <w:t>(</w:t>
+      </w:r>
+      <w:proofErr w:type="gramEnd"/>
+      <w:r>
+        <w:t xml:space="preserve">Title, </w:t>
+      </w:r>
+      <w:proofErr w:type="gramStart"/>
+      <w:r>
+        <w:t>книга(</w:t>
+      </w:r>
+      <w:proofErr w:type="gramEnd"/>
+      <w:r>
+        <w:t xml:space="preserve">_, _, Title, _, _, Borrower, _, _), </w:t>
+      </w:r>
+      <w:proofErr w:type="spellStart"/>
+      <w:r>
+        <w:t>Book_list</w:t>
+      </w:r>
+      <w:proofErr w:type="spellEnd"/>
+      <w:r>
+        <w:t>).</w:t>
+      </w:r>
+    </w:p>
+    <w:p>
+      <w:pPr>
+        <w:pStyle w:val="ac"/>
+      </w:pPr>
+    </w:p>
+    <w:p>
+      <w:pPr>
+        <w:pStyle w:val="ac"/>
+        <w:rPr>
+          <w:lang w:val="ru-RU"/>
+        </w:rPr>
+      </w:pPr>
+      <w:r>
+        <w:rPr>
+          <w:lang w:val="ru-RU"/>
+        </w:rPr>
+        <w:t xml:space="preserve">% 5. </w:t>
+      </w:r>
+      <w:r>
+        <w:rPr>
+          <w:lang w:val="ru-RU"/>
+        </w:rPr>
+        <w:t>Н</w:t>
+      </w:r>
+      <w:r>
+        <w:rPr>
+          <w:lang w:val="ru-RU"/>
+        </w:rPr>
+        <w:t>аличи</w:t>
+      </w:r>
+      <w:r>
+        <w:rPr>
+          <w:lang w:val="ru-RU"/>
+        </w:rPr>
+        <w:t>е</w:t>
+      </w:r>
+      <w:r>
+        <w:rPr>
+          <w:lang w:val="ru-RU"/>
+        </w:rPr>
+        <w:t xml:space="preserve"> двух книг одного издательства, выданных одному абоненту</w:t>
+      </w:r>
+    </w:p>
+    <w:p>
+      <w:pPr>
+        <w:pStyle w:val="ac"/>
+      </w:pPr>
+      <w:r>
+        <w:rPr>
+          <w:b/>
+          <w:bCs/>
+        </w:rPr>
+        <w:t>rule</w:t>
+      </w:r>
+      <w:proofErr w:type="gramStart"/>
+      <w:r>
+        <w:rPr>
+          <w:b/>
+          <w:bCs/>
+        </w:rPr>
+        <w:t>5</w:t>
+      </w:r>
+      <w:r>
+        <w:t xml:space="preserve"> :</w:t>
+      </w:r>
+      <w:proofErr w:type="gramEnd"/>
+      <w:r>
+        <w:t>-</w:t>
+      </w:r>
+    </w:p>
+    <w:p>
+      <w:pPr>
+        <w:pStyle w:val="ac"/>
+      </w:pPr>
+      <w:r>
+        <w:lastRenderedPageBreak/>
+        <w:t xml:space="preserve">    </w:t>
+      </w:r>
+      <w:proofErr w:type="gramStart"/>
+      <w:r>
+        <w:t>книга(</w:t>
+      </w:r>
+      <w:proofErr w:type="gramEnd"/>
+      <w:r>
+        <w:t>_, _, Title1, Publisher, _, Borrower, _, _),</w:t>
+      </w:r>
+    </w:p>
+    <w:p>
+      <w:pPr>
+        <w:pStyle w:val="ac"/>
+      </w:pPr>
+      <w:r>
+        <w:t xml:space="preserve">    </w:t>
+      </w:r>
+      <w:proofErr w:type="gramStart"/>
+      <w:r>
+        <w:t>книга(</w:t>
+      </w:r>
+      <w:proofErr w:type="gramEnd"/>
+      <w:r>
+        <w:t>_, _, Title2, Publisher, _, Borrower, _, _),</w:t>
+      </w:r>
+    </w:p>
+    <w:p>
+      <w:pPr>
+        <w:pStyle w:val="ac"/>
+      </w:pPr>
+      <w:r>
+        <w:t>    Title1 \= Title2</w:t>
+      </w:r>
+      <w:proofErr w:type="gramStart"/>
+      <w:r>
+        <w:t>, !</w:t>
+      </w:r>
+      <w:proofErr w:type="gramEnd"/>
+      <w:r>
+        <w:t>.</w:t>
+      </w:r>
+    </w:p>
+    <w:p>
+      <w:pPr>
+        <w:rPr>
+          <w:lang w:val="en-US"/>
+        </w:rPr>
+      </w:pPr>
+    </w:p>
+    <w:p>
+      <w:r>
+        <w:t xml:space="preserve"> </w:t>
+      </w:r>
+      <w:r>
+        <w:t>Работа правил была протестирована</w:t>
+      </w:r>
+      <w:r>
+        <w:t>:</w:t>
+      </w:r>
+      <w:r>
+        <w:t xml:space="preserve"> в среде </w:t>
+      </w:r>
+      <w:r>
+        <w:rPr>
+          <w:lang w:val="en-US"/>
+        </w:rPr>
+        <w:t>SWI</w:t>
+      </w:r>
+      <w:r>
+        <w:t>-</w:t>
+      </w:r>
+      <w:r>
+        <w:rPr>
+          <w:lang w:val="en-US"/>
+        </w:rPr>
+        <w:t>Prolog</w:t>
+      </w:r>
+      <w:r>
+        <w:t xml:space="preserve"> </w:t>
+      </w:r>
+      <w:r>
+        <w:t xml:space="preserve">был запущен файл с написанными ранее базой данных и правилами, правила по очереди </w:t>
+      </w:r>
+      <w:r>
+        <w:t xml:space="preserve">были </w:t>
+      </w:r>
+      <w:r>
+        <w:t>вызваны</w:t>
+      </w:r>
+      <w:r>
+        <w:t xml:space="preserve"> с указанием необходимых параметров (листинг 2.1)</w:t>
+      </w:r>
+      <w:r>
+        <w:t>.</w:t>
+      </w:r>
+    </w:p>
+    <w:p/>
+    <w:p>
+      <w:pPr>
+        <w:ind w:firstLine="0"/>
+        <w:jc w:val="center"/>
+        <w:rPr>
+          <w:lang w:val="en-US"/>
+        </w:rPr>
+      </w:pPr>
+      <w:r>
+        <w:rPr>
+          <w:noProof/>
+        </w:rPr>
+        <w:drawing>
+          <wp:inline distT="0" distB="0" distL="0" distR="0" wp14:anchorId="328C3D60" wp14:editId="708CD9E1">
+            <wp:extent cx="3252486" cy="2016161"/>
+            <wp:effectExtent l="0" t="0" r="5080" b="3175"/>
+            <wp:docPr id="1635255110" name="Рисунок 1"/>
+            <wp:cNvGraphicFramePr>
+              <a:graphicFrameLocks xmlns:a="http://schemas.openxmlformats.org/drawingml/2006/main" noChangeAspect="1"/>
+            </wp:cNvGraphicFramePr>
+            <a:graphic xmlns:a="http://schemas.openxmlformats.org/drawingml/2006/main">
+              <a:graphicData uri="http://schemas.openxmlformats.org/drawingml/2006/picture">
+                <pic:pic xmlns:pic="http://schemas.openxmlformats.org/drawingml/2006/picture">
+                  <pic:nvPicPr>
+                    <pic:cNvPr id="1635255110" name=""/>
+                    <pic:cNvPicPr/>
+                  </pic:nvPicPr>
+                  <pic:blipFill>
+                    <a:blip r:embed="rId8"/>
+                    <a:stretch>
+                      <a:fillRect/>
+                    </a:stretch>
+                  </pic:blipFill>
+                  <pic:spPr>
+                    <a:xfrm>
+                      <a:off x="0" y="0"/>
+                      <a:ext cx="3263072" cy="2022723"/>
+                    </a:xfrm>
+                    <a:prstGeom prst="rect">
+                      <a:avLst/>
+                    </a:prstGeom>
+                  </pic:spPr>
+                </pic:pic>
+              </a:graphicData>
+            </a:graphic>
+          </wp:inline>
+        </w:drawing>
+      </w:r>
+    </w:p>
+    <w:p>
+      <w:pPr>
+        <w:ind w:firstLine="0"/>
+        <w:jc w:val="center"/>
+      </w:pPr>
+      <w:r>
+        <w:t>Рисунок 2.1 – Результаты проверки выполнения правил</w:t>
+      </w:r>
+    </w:p>
+    <w:p/>
+    <w:p>
+      <w:r>
+        <w:t>Результаты проверки были проинтерпретированы следующим образом:</w:t>
+      </w:r>
+    </w:p>
+    <w:p>
+      <w:pPr>
+        <w:pStyle w:val="a7"/>
+        <w:numPr>
+          <w:ilvl w:val="0"/>
+          <w:numId w:val="13"/>
+        </w:numPr>
+      </w:pPr>
+      <w:r>
+        <w:t>Условие истинно – в базе данных</w:t>
+      </w:r>
+      <w:r>
+        <w:t xml:space="preserve"> есть книги со сроком возврата в диапазоне 5-14 дней (у всех книг срок 10 дней)</w:t>
+      </w:r>
+      <w:r>
+        <w:t>;</w:t>
+      </w:r>
+    </w:p>
+    <w:p>
+      <w:pPr>
+        <w:pStyle w:val="a7"/>
+        <w:numPr>
+          <w:ilvl w:val="0"/>
+          <w:numId w:val="13"/>
+        </w:numPr>
+      </w:pPr>
+      <w:r>
+        <w:t xml:space="preserve">Условие ложно – </w:t>
+      </w:r>
+      <w:r>
+        <w:t>ни у одной книги срок возврата не больше 14 и не меньше 5 дней</w:t>
+      </w:r>
+      <w:r>
+        <w:t>;</w:t>
+      </w:r>
+    </w:p>
+    <w:p>
+      <w:pPr>
+        <w:pStyle w:val="a7"/>
+        <w:numPr>
+          <w:ilvl w:val="0"/>
+          <w:numId w:val="13"/>
+        </w:numPr>
+      </w:pPr>
+      <w:r>
+        <w:t xml:space="preserve">В базе данных есть как минимум одна книга, выданная абоненту, ФИО которого совпадает с её автором – книга под номером 1 (автор и абонент – </w:t>
+      </w:r>
+      <w:r>
+        <w:t>‘</w:t>
+      </w:r>
+      <w:r>
+        <w:t>Егор Курпатый</w:t>
+      </w:r>
+      <w:r>
+        <w:t>’</w:t>
+      </w:r>
+      <w:r>
+        <w:t>)</w:t>
+      </w:r>
+      <w:r>
+        <w:t>;</w:t>
+      </w:r>
+    </w:p>
+    <w:p>
+      <w:pPr>
+        <w:pStyle w:val="a7"/>
+        <w:numPr>
+          <w:ilvl w:val="0"/>
+          <w:numId w:val="13"/>
+        </w:numPr>
+      </w:pPr>
+      <w:r>
+        <w:t xml:space="preserve">При вызове правила в виде списка были выведены названия всех книг, выданных абоненту </w:t>
+      </w:r>
+      <w:r>
+        <w:t>‘</w:t>
+      </w:r>
+      <w:r>
+        <w:t>Иван Липин</w:t>
+      </w:r>
+      <w:r>
+        <w:t>’</w:t>
+      </w:r>
+      <w:r>
+        <w:t xml:space="preserve"> (их две)</w:t>
+      </w:r>
+      <w:r>
+        <w:t>;</w:t>
+      </w:r>
+    </w:p>
+    <w:p>
+      <w:pPr>
+        <w:pStyle w:val="a7"/>
+        <w:numPr>
+          <w:ilvl w:val="0"/>
+          <w:numId w:val="13"/>
+        </w:numPr>
+      </w:pPr>
+      <w:r>
+        <w:t xml:space="preserve">Условие ложно </w:t>
+      </w:r>
+      <w:r>
+        <w:t>–</w:t>
+      </w:r>
+      <w:r>
+        <w:t xml:space="preserve"> </w:t>
+      </w:r>
+      <w:r>
+        <w:t>в базе данных нет прецедента, чтобы одному абоненту было выдано две книги одного издателя</w:t>
+      </w:r>
+      <w:r>
+        <w:t>;</w:t>
+      </w:r>
+    </w:p>
+    <w:p>
+      <w:r>
+        <w:t>Итого, все пять правил выдали верные результаты относительно информации, хранимой в базе данных.</w:t>
       </w:r>
     </w:p>
     <w:p>
@@ -1089,10 +2221,71 @@
     <w:p/>
     <w:p>
       <w:pPr>
-        <w:ind w:firstLine="708"/>
-      </w:pPr>
-      <w:r>
-        <w:t>.</w:t>
+        <w:rPr>
+          <w:szCs w:val="28"/>
+          <w:lang w:eastAsia="ru-RU"/>
+        </w:rPr>
+      </w:pPr>
+      <w:r>
+        <w:rPr>
+          <w:szCs w:val="28"/>
+          <w:lang w:eastAsia="ru-RU"/>
+        </w:rPr>
+        <w:t>В ходе выполнения расч</w:t>
+      </w:r>
+      <w:r>
+        <w:rPr>
+          <w:szCs w:val="28"/>
+          <w:lang w:eastAsia="ru-RU"/>
+        </w:rPr>
+        <w:t>ё</w:t>
+      </w:r>
+      <w:r>
+        <w:rPr>
+          <w:szCs w:val="28"/>
+          <w:lang w:eastAsia="ru-RU"/>
+        </w:rPr>
+        <w:t>тно-графической работы</w:t>
+      </w:r>
+      <w:r>
+        <w:rPr>
+          <w:szCs w:val="28"/>
+          <w:lang w:eastAsia="ru-RU"/>
+        </w:rPr>
+        <w:t xml:space="preserve"> была</w:t>
+      </w:r>
+      <w:r>
+        <w:rPr>
+          <w:szCs w:val="28"/>
+          <w:lang w:eastAsia="ru-RU"/>
+        </w:rPr>
+        <w:t xml:space="preserve"> </w:t>
+      </w:r>
+      <w:r>
+        <w:rPr>
+          <w:szCs w:val="28"/>
+        </w:rPr>
+        <w:t xml:space="preserve">разработана программа на </w:t>
+      </w:r>
+      <w:r>
+        <w:rPr>
+          <w:szCs w:val="28"/>
+        </w:rPr>
+        <w:t xml:space="preserve">языке </w:t>
+      </w:r>
+      <w:proofErr w:type="spellStart"/>
+      <w:r>
+        <w:rPr>
+          <w:szCs w:val="28"/>
+        </w:rPr>
+        <w:t>Prolog</w:t>
+      </w:r>
+      <w:proofErr w:type="spellEnd"/>
+      <w:r>
+        <w:rPr>
+          <w:szCs w:val="28"/>
+        </w:rPr>
+        <w:t xml:space="preserve"> для анализа библиографических данных. Реализованы правила для проверки сроков возврата, совпадения автора и абонента, поиска книг по читателю и выявления книг одного издательства у одного абонента. Программа успешно обработала тестовые данные, подтвердив свою корректность и применимость для автоматизации библиотечного учета.</w:t>
       </w:r>
     </w:p>
     <w:p>
@@ -1101,8 +2294,8 @@
       </w:pPr>
     </w:p>
     <w:sectPr>
-      <w:headerReference w:type="default" r:id="rId8"/>
-      <w:footerReference w:type="default" r:id="rId9"/>
+      <w:headerReference w:type="default" r:id="rId9"/>
+      <w:footerReference w:type="default" r:id="rId10"/>
       <w:pgSz w:w="11906" w:h="16838"/>
       <w:pgMar w:top="1134" w:right="850" w:bottom="1134" w:left="1701" w:header="708" w:footer="708" w:gutter="0"/>
       <w:pgNumType w:start="1"/>
@@ -1847,6 +3040,92 @@
     </w:lvl>
   </w:abstractNum>
   <w:abstractNum w:abstractNumId="6" w15:restartNumberingAfterBreak="0">
+    <w:nsid w:val="46915E12"/>
+    <w:multiLevelType w:val="hybridMultilevel"/>
+    <w:tmpl w:val="485E9F86"/>
+    <w:lvl w:ilvl="0" w:tplc="0419000F">
+      <w:start w:val="1"/>
+      <w:numFmt w:val="decimal"/>
+      <w:lvlText w:val="%1."/>
+      <w:lvlJc w:val="left"/>
+      <w:pPr>
+        <w:ind w:left="1429" w:hanging="360"/>
+      </w:pPr>
+    </w:lvl>
+    <w:lvl w:ilvl="1" w:tplc="04190019" w:tentative="1">
+      <w:start w:val="1"/>
+      <w:numFmt w:val="lowerLetter"/>
+      <w:lvlText w:val="%2."/>
+      <w:lvlJc w:val="left"/>
+      <w:pPr>
+        <w:ind w:left="2149" w:hanging="360"/>
+      </w:pPr>
+    </w:lvl>
+    <w:lvl w:ilvl="2" w:tplc="0419001B" w:tentative="1">
+      <w:start w:val="1"/>
+      <w:numFmt w:val="lowerRoman"/>
+      <w:lvlText w:val="%3."/>
+      <w:lvlJc w:val="right"/>
+      <w:pPr>
+        <w:ind w:left="2869" w:hanging="180"/>
+      </w:pPr>
+    </w:lvl>
+    <w:lvl w:ilvl="3" w:tplc="0419000F" w:tentative="1">
+      <w:start w:val="1"/>
+      <w:numFmt w:val="decimal"/>
+      <w:lvlText w:val="%4."/>
+      <w:lvlJc w:val="left"/>
+      <w:pPr>
+        <w:ind w:left="3589" w:hanging="360"/>
+      </w:pPr>
+    </w:lvl>
+    <w:lvl w:ilvl="4" w:tplc="04190019" w:tentative="1">
+      <w:start w:val="1"/>
+      <w:numFmt w:val="lowerLetter"/>
+      <w:lvlText w:val="%5."/>
+      <w:lvlJc w:val="left"/>
+      <w:pPr>
+        <w:ind w:left="4309" w:hanging="360"/>
+      </w:pPr>
+    </w:lvl>
+    <w:lvl w:ilvl="5" w:tplc="0419001B" w:tentative="1">
+      <w:start w:val="1"/>
+      <w:numFmt w:val="lowerRoman"/>
+      <w:lvlText w:val="%6."/>
+      <w:lvlJc w:val="right"/>
+      <w:pPr>
+        <w:ind w:left="5029" w:hanging="180"/>
+      </w:pPr>
+    </w:lvl>
+    <w:lvl w:ilvl="6" w:tplc="0419000F" w:tentative="1">
+      <w:start w:val="1"/>
+      <w:numFmt w:val="decimal"/>
+      <w:lvlText w:val="%7."/>
+      <w:lvlJc w:val="left"/>
+      <w:pPr>
+        <w:ind w:left="5749" w:hanging="360"/>
+      </w:pPr>
+    </w:lvl>
+    <w:lvl w:ilvl="7" w:tplc="04190019" w:tentative="1">
+      <w:start w:val="1"/>
+      <w:numFmt w:val="lowerLetter"/>
+      <w:lvlText w:val="%8."/>
+      <w:lvlJc w:val="left"/>
+      <w:pPr>
+        <w:ind w:left="6469" w:hanging="360"/>
+      </w:pPr>
+    </w:lvl>
+    <w:lvl w:ilvl="8" w:tplc="0419001B" w:tentative="1">
+      <w:start w:val="1"/>
+      <w:numFmt w:val="lowerRoman"/>
+      <w:lvlText w:val="%9."/>
+      <w:lvlJc w:val="right"/>
+      <w:pPr>
+        <w:ind w:left="7189" w:hanging="180"/>
+      </w:pPr>
+    </w:lvl>
+  </w:abstractNum>
+  <w:abstractNum w:abstractNumId="7" w15:restartNumberingAfterBreak="0">
     <w:nsid w:val="495D4885"/>
     <w:multiLevelType w:val="hybridMultilevel"/>
     <w:tmpl w:val="8E3AC74E"/>
@@ -1932,7 +3211,7 @@
       </w:pPr>
     </w:lvl>
   </w:abstractNum>
-  <w:abstractNum w:abstractNumId="7" w15:restartNumberingAfterBreak="0">
+  <w:abstractNum w:abstractNumId="8" w15:restartNumberingAfterBreak="0">
     <w:nsid w:val="5F852A07"/>
     <w:multiLevelType w:val="hybridMultilevel"/>
     <w:tmpl w:val="FA0E8B22"/>
@@ -2045,7 +3324,7 @@
       </w:rPr>
     </w:lvl>
   </w:abstractNum>
-  <w:abstractNum w:abstractNumId="8" w15:restartNumberingAfterBreak="0">
+  <w:abstractNum w:abstractNumId="9" w15:restartNumberingAfterBreak="0">
     <w:nsid w:val="6A631D11"/>
     <w:multiLevelType w:val="hybridMultilevel"/>
     <w:tmpl w:val="BE566ED8"/>
@@ -2131,7 +3410,7 @@
       </w:pPr>
     </w:lvl>
   </w:abstractNum>
-  <w:abstractNum w:abstractNumId="9" w15:restartNumberingAfterBreak="0">
+  <w:abstractNum w:abstractNumId="10" w15:restartNumberingAfterBreak="0">
     <w:nsid w:val="74D14488"/>
     <w:multiLevelType w:val="hybridMultilevel"/>
     <w:tmpl w:val="CBE0D4C8"/>
@@ -2244,7 +3523,7 @@
       </w:rPr>
     </w:lvl>
   </w:abstractNum>
-  <w:abstractNum w:abstractNumId="10" w15:restartNumberingAfterBreak="0">
+  <w:abstractNum w:abstractNumId="11" w15:restartNumberingAfterBreak="0">
     <w:nsid w:val="74D72AA5"/>
     <w:multiLevelType w:val="hybridMultilevel"/>
     <w:tmpl w:val="486834C4"/>
@@ -2357,7 +3636,7 @@
       </w:rPr>
     </w:lvl>
   </w:abstractNum>
-  <w:abstractNum w:abstractNumId="11" w15:restartNumberingAfterBreak="0">
+  <w:abstractNum w:abstractNumId="12" w15:restartNumberingAfterBreak="0">
     <w:nsid w:val="7EF25CD4"/>
     <w:multiLevelType w:val="hybridMultilevel"/>
     <w:tmpl w:val="E75A10AA"/>
@@ -2480,16 +3759,16 @@
     <w:abstractNumId w:val="3"/>
   </w:num>
   <w:num w:numId="4" w16cid:durableId="2070879149">
-    <w:abstractNumId w:val="7"/>
+    <w:abstractNumId w:val="8"/>
   </w:num>
   <w:num w:numId="5" w16cid:durableId="1109547911">
-    <w:abstractNumId w:val="10"/>
+    <w:abstractNumId w:val="11"/>
   </w:num>
   <w:num w:numId="6" w16cid:durableId="1284769007">
-    <w:abstractNumId w:val="11"/>
+    <w:abstractNumId w:val="12"/>
   </w:num>
   <w:num w:numId="7" w16cid:durableId="780565645">
-    <w:abstractNumId w:val="9"/>
+    <w:abstractNumId w:val="10"/>
   </w:num>
   <w:num w:numId="8" w16cid:durableId="775054236">
     <w:abstractNumId w:val="2"/>
@@ -2498,13 +3777,16 @@
     <w:abstractNumId w:val="5"/>
   </w:num>
   <w:num w:numId="10" w16cid:durableId="355010631">
-    <w:abstractNumId w:val="6"/>
+    <w:abstractNumId w:val="7"/>
   </w:num>
   <w:num w:numId="11" w16cid:durableId="952250147">
     <w:abstractNumId w:val="1"/>
   </w:num>
   <w:num w:numId="12" w16cid:durableId="2059552808">
-    <w:abstractNumId w:val="8"/>
+    <w:abstractNumId w:val="9"/>
+  </w:num>
+  <w:num w:numId="13" w16cid:durableId="1728720993">
+    <w:abstractNumId w:val="6"/>
   </w:num>
   <w:numIdMacAtCleanup w:val="11"/>
 </w:numbering>

</xml_diff>